<commit_message>
fix(odj): les balises de fin de bloc legal sortent des liens hypertexte
docxtemplater cassait le XML en retirant les blocs IRVE et velo : leur balise de
fermeture etait posee dans le <w:t> d'un lien hypertexte (Word refusait d'ouvrir
le fichier). Elles vivent maintenant dans un run a part, en fin de paragraphe.
Gabarit valide au schema dans les deux cas (blocs retires / conserves).

Co-Authored-By: Claude Opus 5 <noreply@anthropic.com>
Claude-Session: https://claude.ai/code/session_012UvtG1jjoVVdqCg1CXCmCE
</commit_message>
<xml_diff>
--- a/src/lib/adapters/docx/gabarits/odj-cs.docx
+++ b/src/lib/adapters/docx/gabarits/odj-cs.docx
@@ -1733,7 +1733,10 @@
         <w:rPr>
           <w:color w:val="000000"/>
         </w:rPr>
-        <w:t xml:space="preserve">Une fois réalisé, le plan pluriannuel de travaux devra être présenté à chaque assemblée générale ordinaire. {/ppt}</w:t>
+        <w:t xml:space="preserve">Une fois réalisé, le plan pluriannuel de travaux devra être présenté à chaque assemblée générale ordinaire. </w:t>
+      </w:r>
+      <w:r>
+        <w:t>{/ppt}</w:t>
       </w:r>
     </w:p>
     <w:p>
@@ -1861,7 +1864,10 @@
         <w:rPr>
           <w:color w:val="000000"/>
         </w:rPr>
-        <w:t>1er Janvier 2026 pour les copropriétés de moins de 50 lots.{/dpe}</w:t>
+        <w:t>1er Janvier 2026 pour les copropriétés de moins de 50 lots.</w:t>
+      </w:r>
+      <w:r>
+        <w:t>{/dpe}</w:t>
       </w:r>
     </w:p>
     <w:p>
@@ -2003,9 +2009,12 @@
           <w:rPr>
             <w:rStyle w:val="Lienhypertexte"/>
           </w:rPr>
-          <w:t>https://www.legifrance.gouv.fr/loda/article_lc/LEGIARTI000039784801{/irve}</w:t>
+          <w:t>https://www.legifrance.gouv.fr/loda/article_lc/LEGIARTI000039784801</w:t>
         </w:r>
       </w:hyperlink>
+      <w:r>
+        <w:t>{/irve}</w:t>
+      </w:r>
     </w:p>
     <w:p>
       <w:pPr>
@@ -2154,7 +2163,7 @@
           <w:rPr>
             <w:rStyle w:val="Lienhypertexte"/>
           </w:rPr>
-          <w:t>https://www.legifrance.gouv.fr/loda/article_lc/LEGIARTI000039784801{/velo}</w:t>
+          <w:t>https://www.legifrance.gouv.fr/loda/article_lc/LEGIARTI000039784801</w:t>
         </w:r>
       </w:hyperlink>
       <w:r>
@@ -2163,6 +2172,9 @@
         </w:rPr>
         <w:t xml:space="preserve"> </w:t>
       </w:r>
+      <w:r>
+        <w:t>{/velo}</w:t>
+      </w:r>
     </w:p>
     <w:p>
       <w:pPr>
@@ -2375,7 +2387,10 @@
         <w:rPr>
           <w:color w:val="000000"/>
         </w:rPr>
-        <w:t xml:space="preserve">Décision du CS : {/agHybride}</w:t>
+        <w:t xml:space="preserve">Décision du CS : </w:t>
+      </w:r>
+      <w:r>
+        <w:t>{/agHybride}</w:t>
       </w:r>
     </w:p>
     <w:p>
@@ -2449,7 +2464,10 @@
           <w:iCs/>
           <w:color w:val="000000"/>
         </w:rPr>
-        <w:t xml:space="preserve">Il est rappelé, à l'ensemble des copropriétaires, l'article 8 de la loi n°2024-1039 du 19 novembre 2024 (loi Le Meur) venant compléter l'article 9 de la loi n°65-557 du 10 juillet 1965 : "Art. 9-2 - Lorsqu'un lot de copropriété fait l'objet de la déclaration prévue à l'article L. 324-1-1 du code du tourisme, le copropriétaire ou, par son intermédiaire, le locataire qui y a été autorisé en informe le syndic. Un point d'information par le syndic relatif à l'activité de location de meublés touristiques au sein de la copropriété est inscrit à l'ordre du jour de la prochaine assemblée générale."{/locationTouristique}</w:t>
+        <w:t xml:space="preserve">Il est rappelé, à l'ensemble des copropriétaires, l'article 8 de la loi n°2024-1039 du 19 novembre 2024 (loi Le Meur) venant compléter l'article 9 de la loi n°65-557 du 10 juillet 1965 : "Art. 9-2 - Lorsqu'un lot de copropriété fait l'objet de la déclaration prévue à l'article L. 324-1-1 du code du tourisme, le copropriétaire ou, par son intermédiaire, le locataire qui y a été autorisé en informe le syndic. Un point d'information par le syndic relatif à l'activité de location de meublés touristiques au sein de la copropriété est inscrit à l'ordre du jour de la prochaine assemblée générale."</w:t>
+      </w:r>
+      <w:r>
+        <w:t>{/locationTouristique}</w:t>
       </w:r>
     </w:p>
     <w:p>

</xml_diff>

<commit_message>
fix(odj): plus de titre 'Verification interne' orphelin dans le Word du CS
Retirer les puces d'un bloc laissait son titre seul (releve par Sekou sur la S0306,
juste avant 'Gestion courante'). Le gabarit supprime desormais tout titre
'Verification interne :' qui n'a plus de contenu.

Co-Authored-By: Claude Opus 5 <noreply@anthropic.com>
Claude-Session: https://claude.ai/code/session_012UvtG1jjoVVdqCg1CXCmCE
</commit_message>
<xml_diff>
--- a/src/lib/adapters/docx/gabarits/odj-cs.docx
+++ b/src/lib/adapters/docx/gabarits/odj-cs.docx
@@ -677,21 +677,6 @@
         <w:pStyle w:val="Sansinterligne"/>
         <w:jc w:val="both"/>
       </w:pPr>
-    </w:p>
-    <w:p>
-      <w:pPr>
-        <w:pStyle w:val="Sansinterligne"/>
-        <w:jc w:val="both"/>
-        <w:rPr>
-          <w:i/>
-        </w:rPr>
-      </w:pPr>
-      <w:r>
-        <w:rPr>
-          <w:i/>
-        </w:rPr>
-        <w:t xml:space="preserve">Vérification interne : </w:t>
-      </w:r>
     </w:p>
     <w:p>
       <w:pPr>
@@ -1181,25 +1166,6 @@
           <w:color w:val="000000"/>
         </w:rPr>
       </w:pPr>
-    </w:p>
-    <w:p>
-      <w:pPr>
-        <w:shd w:val="clear" w:color="auto" w:fill="FFFFFF"/>
-        <w:jc w:val="both"/>
-        <w:rPr>
-          <w:i/>
-          <w:iCs/>
-          <w:color w:val="000000"/>
-        </w:rPr>
-      </w:pPr>
-      <w:r>
-        <w:rPr>
-          <w:i/>
-          <w:iCs/>
-          <w:color w:val="000000"/>
-        </w:rPr>
-        <w:t>Vérification interne</w:t>
-      </w:r>
     </w:p>
     <w:p>
       <w:pPr>

</xml_diff>